<commit_message>
docs: V3 — SETUP upgrade guide + loan/formatting workflows, HARDENING map, onboarding guide regenerated, tracker complete
Co-Authored-By: Claude Opus 4.8 <noreply@anthropic.com>
</commit_message>
<xml_diff>
--- a/Surge Finance - Coordinator Onboarding Guide.docx
+++ b/Surge Finance - Coordinator Onboarding Guide.docx
@@ -590,6 +590,34 @@
             </w:pPr>
             <w:r>
               <w:t xml:space="preserve">Per-project budgets with spent / committed / remaining and a health bar.</w:t>
+            </w:r>
+          </w:p>
+        </w:tc>
+      </w:tr>
+      <w:tr>
+        <w:tc>
+          <w:tcPr>
+            <w:tcW w:w="2600" w:type="dxa"/>
+          </w:tcPr>
+          <w:p>
+            <w:pPr>
+              <w:spacing w:after="0" w:before="0"/>
+            </w:pPr>
+            <w:r>
+              <w:t xml:space="preserve">Loans</w:t>
+            </w:r>
+          </w:p>
+        </w:tc>
+        <w:tc>
+          <w:tcPr>
+            <w:tcW w:w="6760" w:type="dxa"/>
+          </w:tcPr>
+          <w:p>
+            <w:pPr>
+              <w:spacing w:after="0" w:before="0"/>
+            </w:pPr>
+            <w:r>
+              <w:t xml:space="preserve">Money members lent the club (e.g. a large expense on a personal card). Status, IDs and overdue flags are automatic; repayments are typed into Amount Repaid.</w:t>
             </w:r>
           </w:p>
         </w:tc>
@@ -1070,6 +1098,47 @@
               <w:spacing w:after="0" w:before="0"/>
             </w:pPr>
             <w:r>
+              <w:t xml:space="preserve">Apply Rich Formatting</w:t>
+            </w:r>
+          </w:p>
+        </w:tc>
+        <w:tc>
+          <w:tcPr>
+            <w:tcW w:w="4180" w:type="dxa"/>
+          </w:tcPr>
+          <w:p>
+            <w:pPr>
+              <w:spacing w:after="0" w:before="0"/>
+            </w:pPr>
+            <w:r>
+              <w:t xml:space="preserve">Re-applies the colour-coding rules to every sheet (safe anytime).</w:t>
+            </w:r>
+          </w:p>
+        </w:tc>
+        <w:tc>
+          <w:tcPr>
+            <w:tcW w:w="2180" w:type="dxa"/>
+          </w:tcPr>
+          <w:p>
+            <w:pPr>
+              <w:spacing w:after="0" w:before="0"/>
+            </w:pPr>
+            <w:r>
+              <w:t xml:space="preserve">Coordinator</w:t>
+            </w:r>
+          </w:p>
+        </w:tc>
+      </w:tr>
+      <w:tr>
+        <w:tc>
+          <w:tcPr>
+            <w:tcW w:w="3000" w:type="dxa"/>
+          </w:tcPr>
+          <w:p>
+            <w:pPr>
+              <w:spacing w:after="0" w:before="0"/>
+            </w:pPr>
+            <w:r>
               <w:t xml:space="preserve">Year-End Rollover / Archive Prior Years</w:t>
             </w:r>
           </w:p>
@@ -1632,7 +1701,68 @@
         <w:pStyle w:val="Heading2"/>
       </w:pPr>
       <w:r>
-        <w:t xml:space="preserve">6.7 Rejecting a submission</w:t>
+        <w:t xml:space="preserve">6.7 Recording a member loan (someone lends the club money)</w:t>
+      </w:r>
+    </w:p>
+    <w:p>
+      <w:r>
+        <w:t xml:space="preserve">The opposite case: a member fronts money FOR the club (e.g. a big deposit on their credit card) and must be paid back.</w:t>
+      </w:r>
+    </w:p>
+    <w:p>
+      <w:pPr>
+        <w:pStyle w:val="ListParagraph"/>
+        <w:numPr>
+          <w:ilvl w:val="0"/>
+          <w:numId w:val="8"/>
+        </w:numPr>
+      </w:pPr>
+      <w:r>
+        <w:t xml:space="preserve">Open the Loans tab and add a row: Lender Name, Date Received, Amount, Purpose. The Loan ID and Status (Open) fill in automatically.</w:t>
+      </w:r>
+    </w:p>
+    <w:p>
+      <w:pPr>
+        <w:pStyle w:val="ListParagraph"/>
+        <w:numPr>
+          <w:ilvl w:val="0"/>
+          <w:numId w:val="8"/>
+        </w:numPr>
+      </w:pPr>
+      <w:r>
+        <w:t xml:space="preserve">Optional: put the matching CR number in Linked CR # - when that CR is Distributed, the system reminds you to repay them. A Due Date adds an overdue warning.</w:t>
+      </w:r>
+    </w:p>
+    <w:p>
+      <w:pPr>
+        <w:pStyle w:val="ListParagraph"/>
+        <w:numPr>
+          <w:ilvl w:val="0"/>
+          <w:numId w:val="8"/>
+        </w:numPr>
+      </w:pPr>
+      <w:r>
+        <w:t xml:space="preserve">When you repay (fully or partially), type the running total into Amount Repaid. Status flips to Partially Repaid / Repaid and Date Repaid fills itself.</w:t>
+      </w:r>
+    </w:p>
+    <w:p>
+      <w:pPr>
+        <w:pStyle w:val="ListParagraph"/>
+        <w:numPr>
+          <w:ilvl w:val="0"/>
+          <w:numId w:val="8"/>
+        </w:numPr>
+      </w:pPr>
+      <w:r>
+        <w:t xml:space="preserve">The dashboard "Liabilities - owed to people" card shows loans and advances together, and Year-End will not pass until all loans are Repaid.</w:t>
+      </w:r>
+    </w:p>
+    <w:p>
+      <w:pPr>
+        <w:pStyle w:val="Heading2"/>
+      </w:pPr>
+      <w:r>
+        <w:t xml:space="preserve">6.8 Rejecting a submission</w:t>
       </w:r>
     </w:p>
     <w:p>
@@ -1645,7 +1775,7 @@
         <w:pStyle w:val="Heading2"/>
       </w:pPr>
       <w:r>
-        <w:t xml:space="preserve">6.8 Fixing mistakes</w:t>
+        <w:t xml:space="preserve">6.9 Fixing mistakes</w:t>
       </w:r>
     </w:p>
     <w:p>
@@ -1689,27 +1819,27 @@
         <w:pStyle w:val="Heading2"/>
       </w:pPr>
       <w:r>
-        <w:t xml:space="preserve">6.9 Year-end rollover</w:t>
-      </w:r>
-    </w:p>
-    <w:p>
-      <w:pPr>
-        <w:pStyle w:val="ListParagraph"/>
-        <w:numPr>
-          <w:ilvl w:val="0"/>
-          <w:numId w:val="8"/>
-        </w:numPr>
-      </w:pPr>
-      <w:r>
-        <w:t xml:space="preserve">Open the Year-End page on the website to see what is left (open CRs, unpaid balances, open grants, non-closed budgets, pending items).</w:t>
-      </w:r>
-    </w:p>
-    <w:p>
-      <w:pPr>
-        <w:pStyle w:val="ListParagraph"/>
-        <w:numPr>
-          <w:ilvl w:val="0"/>
-          <w:numId w:val="8"/>
+        <w:t xml:space="preserve">6.10 Year-end rollover</w:t>
+      </w:r>
+    </w:p>
+    <w:p>
+      <w:pPr>
+        <w:pStyle w:val="ListParagraph"/>
+        <w:numPr>
+          <w:ilvl w:val="0"/>
+          <w:numId w:val="9"/>
+        </w:numPr>
+      </w:pPr>
+      <w:r>
+        <w:t xml:space="preserve">Open the Year-End page on the website to see what is left (open CRs, unpaid balances, open grants, non-closed budgets, pending items, unpaid member loans).</w:t>
+      </w:r>
+    </w:p>
+    <w:p>
+      <w:pPr>
+        <w:pStyle w:val="ListParagraph"/>
+        <w:numPr>
+          <w:ilvl w:val="0"/>
+          <w:numId w:val="9"/>
         </w:numPr>
       </w:pPr>
       <w:r>
@@ -1721,7 +1851,7 @@
         <w:pStyle w:val="ListParagraph"/>
         <w:numPr>
           <w:ilvl w:val="0"/>
-          <w:numId w:val="8"/>
+          <w:numId w:val="9"/>
         </w:numPr>
       </w:pPr>
       <w:r>

</xml_diff>